<commit_message>
Lay the manuscript out for review and add vector figures
- Manuscript double-spaced with continuous line numbers and page numbers;
  the four tables follow the references, one per page, and the figures are
  no longer embedded since JACR takes them as separate files.
- docstyle.py replaces python-docx's blue Calibri Light Title/Heading styles
  with black Times New Roman in every document, and drops the rule under Title.
- figs.py / figs2.py also write JACR_Figure1-3.pdf (vector, TrueType fonts
  embedded), meeting Elsevier's line-art resolution requirement; the PNGs
  regenerate pixel-identical.
- jacr_check.py now also scans the tables, which moved past the references.
- Submission sheet: author consent and the AI declaration recorded as settled.

Co-Authored-By: Claude Opus 5.5 <noreply@anthropic.com>
Claude-Session: https://claude.ai/code/session_013TkounLTBFVQRstE3VnhkM
</commit_message>
<xml_diff>
--- a/JACR_1_CoverLetter.docx
+++ b/JACR_1_CoverLetter.docx
@@ -567,7 +567,7 @@
     <w:qFormat/>
     <w:rsid w:val="00FC693F"/>
     <w:rPr>
-      <w:rFonts w:ascii="Times New Roman" w:hAnsi="Times New Roman"/>
+      <w:rFonts w:ascii="Times New Roman" w:hAnsi="Times New Roman" w:eastAsia="Times New Roman"/>
       <w:sz w:val="22"/>
     </w:rPr>
   </w:style>
@@ -630,11 +630,12 @@
       <w:outlineLvl w:val="0"/>
     </w:pPr>
     <w:rPr>
-      <w:rFonts w:asciiTheme="majorHAnsi" w:eastAsiaTheme="majorEastAsia" w:hAnsiTheme="majorHAnsi" w:cstheme="majorBidi"/>
+      <w:rFonts w:ascii="Times New Roman" w:hAnsi="Times New Roman" w:eastAsia="Times New Roman" w:cs="Times New Roman"/>
       <w:b/>
       <w:bCs/>
-      <w:color w:val="365F91" w:themeColor="accent1" w:themeShade="BF"/>
-      <w:sz w:val="28"/>
+      <w:i w:val="0"/>
+      <w:color w:val="000000"/>
+      <w:sz w:val="26"/>
       <w:szCs w:val="28"/>
     </w:rPr>
   </w:style>
@@ -654,11 +655,12 @@
       <w:outlineLvl w:val="1"/>
     </w:pPr>
     <w:rPr>
-      <w:rFonts w:asciiTheme="majorHAnsi" w:eastAsiaTheme="majorEastAsia" w:hAnsiTheme="majorHAnsi" w:cstheme="majorBidi"/>
+      <w:rFonts w:ascii="Times New Roman" w:hAnsi="Times New Roman" w:eastAsia="Times New Roman" w:cs="Times New Roman"/>
       <w:b/>
       <w:bCs/>
-      <w:color w:val="4F81BD" w:themeColor="accent1"/>
-      <w:sz w:val="26"/>
+      <w:i/>
+      <w:color w:val="000000"/>
+      <w:sz w:val="24"/>
       <w:szCs w:val="26"/>
     </w:rPr>
   </w:style>
@@ -912,18 +914,17 @@
     <w:qFormat/>
     <w:rsid w:val="00FC693F"/>
     <w:pPr>
-      <w:pBdr>
-        <w:bottom w:val="single" w:sz="8" w:space="4" w:color="4F81BD" w:themeColor="accent1"/>
-      </w:pBdr>
       <w:spacing w:after="300" w:line="240" w:lineRule="auto"/>
       <w:contextualSpacing/>
     </w:pPr>
     <w:rPr>
-      <w:rFonts w:asciiTheme="majorHAnsi" w:eastAsiaTheme="majorEastAsia" w:hAnsiTheme="majorHAnsi" w:cstheme="majorBidi"/>
-      <w:color w:val="17365D" w:themeColor="text2" w:themeShade="BF"/>
+      <w:rFonts w:ascii="Times New Roman" w:hAnsi="Times New Roman" w:eastAsia="Times New Roman" w:cs="Times New Roman"/>
+      <w:b/>
+      <w:i w:val="0"/>
+      <w:color w:val="000000"/>
       <w:spacing w:val="5"/>
       <w:kern w:val="28"/>
-      <w:sz w:val="52"/>
+      <w:sz w:val="32"/>
       <w:szCs w:val="52"/>
     </w:rPr>
   </w:style>

</xml_diff>

<commit_message>
Polish the English of the cover letter and Supplements 1-4
Same rules as the main text: numbers, number words, abbreviations and table
references unchanged; statistical statements left as written. Two causal phrases
in the cover letter and Supplement 2 (S2.4) now match the descriptive wording the
manuscript already uses. Supplement 1 names the deposited script correctly.

Number check 354 rows, 0 inconsistent; JACR checks pass.

Co-Authored-By: Claude Sonnet 5.5 <noreply@anthropic.com>
Claude-Session: https://claude.ai/code/session_013TkounLTBFVQRstE3VnhkM
</commit_message>
<xml_diff>
--- a/JACR_1_CoverLetter.docx
+++ b/JACR_1_CoverLetter.docx
@@ -100,7 +100,7 @@
         <w:spacing w:after="160"/>
       </w:pPr>
       <w:r>
-        <w:t xml:space="preserve">Ultrasound-first pathways for suspected intestinal malrotation are being adopted on the strength of studies reporting sensitivities of 93–97%, a performance attributed to assessment of the third portion of the duodenum (D3), the duodenojejunal junction and the mesenteric vessels. Most of that evidence postdates the 2020 ACR Appropriateness Criteria, which rate ultrasound as "may be appropriate" and the upper gastrointestinal series as "usually appropriate" for bilious vomiting in infants older than 2 days. Whether routine reports document those elements, and how this relates to whether the diagnosis is reported, has not, to our knowledge, been examined at scale. This is a question of clinical practice management, namely the content and quality of routine radiology reports, rather than of the intrinsic accuracy of a modality, which is why we are submitting it to </w:t>
+        <w:t xml:space="preserve">Ultrasound-first pathways for suspected intestinal malrotation are being adopted on the basis of studies reporting sensitivities of 93–97%, a performance attributed to assessment of the third portion of the duodenum (D3), the duodenojejunal junction and the mesenteric vessels. Most of that evidence postdates the 2020 ACR Appropriateness Criteria, which rate ultrasound as "may be appropriate" and the upper gastrointestinal series as "usually appropriate" for bilious vomiting in infants older than 2 days. To our knowledge, no study has examined at scale whether routine reports document those elements or how documentation relates to whether the diagnosis is reported. This is a question of clinical practice management, namely the content and quality of routine radiology reports, rather than the intrinsic accuracy of a modality, which is why we are submitting it to </w:t>
       </w:r>
       <w:r>
         <w:rPr>
@@ -117,7 +117,7 @@
         <w:spacing w:after="160"/>
       </w:pPr>
       <w:r>
-        <w:t xml:space="preserve">We audited 13.6 years of routine reports at a tertiary children's hospital: 723 preoperative index examinations in 398 children with surgically confirmed malrotation, coding each examination both for whether it named the diagnosis and for the technical elements it documented, the ultrasound elements independently by an ultrasound physician and a pediatric surgeon. </w:t>
+        <w:t xml:space="preserve">We audited 13.6 years of routine reports at a tertiary children's hospital: 723 preoperative index examinations in 398 children with surgically confirmed malrotation. Each examination was coded for whether it named the diagnosis and for the technical elements it documented; the ultrasound elements were coded independently by an ultrasound physician and a pediatric surgeon. </w:t>
       </w:r>
       <w:r>
         <w:rPr>
@@ -126,7 +126,7 @@
         <w:t>Only three of 117 ultrasound examinations (2.6%) documented D3 or the duodenojejunal junction</w:t>
       </w:r>
       <w:r>
-        <w:t>; the superior mesenteric artery–vein relationship was stated in three, enteric fluid administration was recorded twice, and a whirlpool sign was reported in 50.4%. Detection followed that content closely: 5 of the 58 examinations without a reported whirlpool named the diagnosis, and a whirlpool was reported in only 59 of the 112 children in whom operation confirmed midgut volvulus. In routine practice, a positive ultrasound report rested almost entirely on the whirlpool sign, a sign of volvulus.</w:t>
+        <w:t>; the superior mesenteric artery–vein relationship was stated in three, enteric fluid administration was recorded twice, and a whirlpool sign was reported in 50.4%. Detection was closely tied to the whirlpool: 5 of the 58 examinations without a reported whirlpool named the diagnosis, and a whirlpool was reported in only 59 of the 112 children with operatively confirmed midgut volvulus. Positive ultrasound reports almost always described a whirlpool, a sign of volvulus.</w:t>
       </w:r>
     </w:p>
     <w:p>
@@ -134,7 +134,7 @@
         <w:spacing w:after="160"/>
       </w:pPr>
       <w:r>
-        <w:t>Whirlpool reporting rose in the later years of the study, while the duodenal landmarks stayed rare. An exploratory analysis of the change in ultrasound detection over time is reported as such: the difference between eras was imprecise and its association with how examinations were booked cannot be separated from the indication for the test.</w:t>
+        <w:t>Whirlpool reporting rose in the later years of the study, whereas the duodenal landmarks stayed rare. The change in ultrasound detection over time is reported as an exploratory analysis: the difference between eras was imprecise, and its association with how examinations were booked cannot be separated from the indication for the test.</w:t>
       </w:r>
     </w:p>
     <w:p>
@@ -142,7 +142,7 @@
         <w:spacing w:after="160"/>
       </w:pPr>
       <w:r>
-        <w:t>For radiology departments the implication is practical, and the submission provides the means to act on it. Unlike accuracy, documentation needs no reference standard: it can be audited prospectively in every examination requested for suspected malrotation. Supplement 4 sets out the audited elements as a minimum reporting dataset, with the documentation rates found here as the baseline against which a department can re-audit after introducing a structured report. The classification of free-text reports, a transparent rule-based method with negation handling and blinded adjudication, is provided in full with a runnable implementation, so that it can be applied wherever reports are stored electronically.</w:t>
+        <w:t>The implication for radiology departments is practical, and the submission provides the means to act on it. Unlike accuracy, documentation needs no reference standard and can be audited prospectively in every examination requested for suspected malrotation. Supplement 4 sets out the audited elements as a minimum reporting dataset, with the documentation rates found here as the baseline against which a department can re-audit after introducing a structured report. The method used to classify the free-text reports, a transparent rule-based algorithm with negation handling and blinded adjudication, is provided in full with a runnable implementation, so that it can be applied wherever reports are stored electronically.</w:t>
       </w:r>
     </w:p>
     <w:p>
@@ -150,7 +150,7 @@
         <w:spacing w:after="160"/>
       </w:pPr>
       <w:r>
-        <w:t>We are explicit about what the design cannot support. The cohort consists only of surgically confirmed cases, so the study estimates report-level detection and not sensitivity; specificity, predictive values and any ranking of ultrasound, CT and the upper gastrointestinal series are neither estimable nor claimed. We have used the term "detection rate" throughout, followed STROBE rather than STARD (checklist enclosed), displayed the confounding by indication rather than adjusting it away, and stated that these data are no argument against ultrasound-first pathways. This is a single-center, first audit cycle: whether a structured report changes documentation or detection has not been tested, and we say so.</w:t>
+        <w:t>The design has clear limits. The cohort consists only of surgically confirmed cases, so the study estimates report-level detection, not sensitivity; specificity, predictive values and any ranking of ultrasound, CT and the upper gastrointestinal series can be neither estimated nor claimed. We therefore use the term "detection rate" throughout, follow STROBE rather than STARD (checklist enclosed), show the confounding by indication instead of adjusting it away, and state that these data do not argue against ultrasound-first pathways. This is a single-center, first audit cycle, and whether a structured report changes documentation or detection has not been tested.</w:t>
       </w:r>
     </w:p>
     <w:p>

</xml_diff>